<commit_message>
feat(tcc): nota "Como ler" nas quatro figuras do núcleo e no waterfall SHAP
Três das oito figuras já tinham a nota; faltava justamente nas que a banca
olha enquanto o autor fala. A divisão de trabalho é explícita no gerador: o
título da figura afirma o achado (SWD-55), a nota explica só a mecânica — o que
é cada barra, o que é a faixa, o que marca a linha de referência — e nunca
repete a conclusão.

Exceção deliberada no waterfall SHAP, onde a nota também alerta que é um caso
individual e não serve para generalizar: é a figura do documento que mais
convida à leitura errada.

Relatório: 38 páginas, 0 erros, 0 referências indefinidas, 0 "(??)". Word
regerado do mesmo .tex.

Co-Authored-By: Claude Opus 5 (1M context) <noreply@anthropic.com>
</commit_message>
<xml_diff>
--- a/entregaveis/relatorio_tcc_enxuto.docx
+++ b/entregaveis/relatorio_tcc_enxuto.docx
@@ -17690,6 +17690,57 @@
       </w:pPr>
       <w:r>
         <w:rPr>
+          <w:i/>
+          <w:iCs/>
+        </w:rPr>
+        <w:t xml:space="preserve">Como ler a Figura </w:t>
+      </w:r>
+      <w:hyperlink w:anchor="fig:shap_wf">
+        <w:r>
+          <w:rPr>
+            <w:rStyle w:val="Hyperlink"/>
+            <w:i/>
+            <w:iCs/>
+          </w:rPr>
+          <w:t xml:space="preserve">3</w:t>
+        </w:r>
+      </w:hyperlink>
+      <w:r>
+        <w:rPr>
+          <w:i/>
+          <w:iCs/>
+        </w:rPr>
+        <w:t xml:space="preserve">:</w:t>
+      </w:r>
+      <w:r>
+        <w:t xml:space="preserve"> </w:t>
+      </w:r>
+      <w:r>
+        <w:t xml:space="preserve">cada linha é uma variável de</w:t>
+      </w:r>
+      <w:r>
+        <w:t xml:space="preserve"> </w:t>
+      </w:r>
+      <w:r>
+        <w:rPr>
+          <w:b/>
+          <w:bCs/>
+        </w:rPr>
+        <w:t xml:space="preserve">um</w:t>
+      </w:r>
+      <w:r>
+        <w:t xml:space="preserve"> </w:t>
+      </w:r>
+      <w:r>
+        <w:t xml:space="preserve">trabalhador — não de uma média. A barra mostra quanto aquela variável empurra a previsão para cima ou para baixo, partindo da previsão média da base até a previsão final do caso. Serve para ver como o modelo compõe uma decisão, não para generalizar.</w:t>
+      </w:r>
+    </w:p>
+    <w:p>
+      <w:pPr>
+        <w:pStyle w:val="BodyText"/>
+      </w:pPr>
+      <w:r>
+        <w:rPr>
           <w:b/>
           <w:bCs/>
         </w:rPr>
@@ -18426,6 +18477,41 @@
       </w:r>
     </w:p>
     <w:bookmarkEnd w:id="49"/>
+    <w:p>
+      <w:pPr>
+        <w:pStyle w:val="BodyText"/>
+      </w:pPr>
+      <w:r>
+        <w:rPr>
+          <w:i/>
+          <w:iCs/>
+        </w:rPr>
+        <w:t xml:space="preserve">Como ler a Figura </w:t>
+      </w:r>
+      <w:hyperlink w:anchor="fig:hlm_gap">
+        <w:r>
+          <w:rPr>
+            <w:rStyle w:val="Hyperlink"/>
+            <w:i/>
+            <w:iCs/>
+          </w:rPr>
+          <w:t xml:space="preserve">4</w:t>
+        </w:r>
+      </w:hyperlink>
+      <w:r>
+        <w:rPr>
+          <w:i/>
+          <w:iCs/>
+        </w:rPr>
+        <w:t xml:space="preserve">:</w:t>
+      </w:r>
+      <w:r>
+        <w:t xml:space="preserve"> </w:t>
+      </w:r>
+      <w:r>
+        <w:t xml:space="preserve">cada barra é um modelo da sequência e, de cima para baixo, acrescenta-se um bloco de controles ao anterior. O comprimento da barra é a penalidade racial em log-rendimento e o rótulo dentro dela, a mesma penalidade em % de renda; o traço fino é o intervalo de confiança de 95% com erro-padrão agrupado por UPA. Em azul, o M3 — o gap líquido.</w:t>
+      </w:r>
+    </w:p>
     <w:bookmarkEnd w:id="50"/>
     <w:bookmarkStart w:id="56" w:name="X0e69078f56ff2fc58d4b5157c72cc4a5dec12bc"/>
     <w:p>
@@ -19454,6 +19540,41 @@
       </w:r>
     </w:p>
     <w:bookmarkEnd w:id="55"/>
+    <w:p>
+      <w:pPr>
+        <w:pStyle w:val="BodyText"/>
+      </w:pPr>
+      <w:r>
+        <w:rPr>
+          <w:i/>
+          <w:iCs/>
+        </w:rPr>
+        <w:t xml:space="preserve">Como ler a Figura </w:t>
+      </w:r>
+      <w:hyperlink w:anchor="fig:ob_cascata">
+        <w:r>
+          <w:rPr>
+            <w:rStyle w:val="Hyperlink"/>
+            <w:i/>
+            <w:iCs/>
+          </w:rPr>
+          <w:t xml:space="preserve">5</w:t>
+        </w:r>
+      </w:hyperlink>
+      <w:r>
+        <w:rPr>
+          <w:i/>
+          <w:iCs/>
+        </w:rPr>
+        <w:t xml:space="preserve">:</w:t>
+      </w:r>
+      <w:r>
+        <w:t xml:space="preserve"> </w:t>
+      </w:r>
+      <w:r>
+        <w:t xml:space="preserve">cada painel é uma cascata lida da esquerda para a direita. A primeira barra é o gap total em log-rendimento; a segunda desconta a parcela atribuída a diferenças de características (dotações); a terceira, em azul, é o que sobra sem explicação. A única diferença entre os painéis é se a ocupação entra ou não como característica.</w:t>
+      </w:r>
+    </w:p>
     <w:bookmarkEnd w:id="56"/>
     <w:bookmarkStart w:id="63" w:name="Xc30b935695c470ed471485b7fb71c737b555f84"/>
     <w:p>
@@ -22165,6 +22286,98 @@
       </w:r>
     </w:p>
     <w:bookmarkEnd w:id="62"/>
+    <w:p>
+      <w:pPr>
+        <w:pStyle w:val="BodyText"/>
+      </w:pPr>
+      <w:r>
+        <w:rPr>
+          <w:i/>
+          <w:iCs/>
+        </w:rPr>
+        <w:t xml:space="preserve">Como ler a Figura </w:t>
+      </w:r>
+      <w:hyperlink w:anchor="fig:qr_rif">
+        <w:r>
+          <w:rPr>
+            <w:rStyle w:val="Hyperlink"/>
+            <w:i/>
+            <w:iCs/>
+          </w:rPr>
+          <w:t xml:space="preserve">6</w:t>
+        </w:r>
+      </w:hyperlink>
+      <w:r>
+        <w:rPr>
+          <w:i/>
+          <w:iCs/>
+        </w:rPr>
+        <w:t xml:space="preserve">:</w:t>
+      </w:r>
+      <w:r>
+        <w:t xml:space="preserve"> </w:t>
+      </w:r>
+      <w:r>
+        <w:t xml:space="preserve">à esquerda, cada ponto é a penalidade racial estimada num quantil</w:t>
+      </w:r>
+      <w:r>
+        <w:t xml:space="preserve"> </w:t>
+      </w:r>
+      <w:r>
+        <w:rPr>
+          <w:i/>
+          <w:iCs/>
+        </w:rPr>
+        <w:t xml:space="preserve">condicional</w:t>
+      </w:r>
+      <w:r>
+        <w:t xml:space="preserve"> </w:t>
+      </w:r>
+      <m:oMath>
+        <m:r>
+          <m:t>τ</m:t>
+        </m:r>
+      </m:oMath>
+      <w:r>
+        <w:t xml:space="preserve"> </w:t>
+      </w:r>
+      <w:r>
+        <w:t xml:space="preserve">(eixo vertical em log-pontos</w:t>
+      </w:r>
+      <w:r>
+        <w:t xml:space="preserve"> </w:t>
+      </w:r>
+      <m:oMath>
+        <m:r>
+          <m:rPr>
+            <m:sty m:val="p"/>
+          </m:rPr>
+          <m:t>×</m:t>
+        </m:r>
+        <m:r>
+          <m:t>100</m:t>
+        </m:r>
+      </m:oMath>
+      <w:r>
+        <w:t xml:space="preserve">), e a faixa é o intervalo de 95% por bootstrap em blocos de UPA. À direita, cada barra é um quantil</w:t>
+      </w:r>
+      <w:r>
+        <w:t xml:space="preserve"> </w:t>
+      </w:r>
+      <w:r>
+        <w:rPr>
+          <w:i/>
+          <w:iCs/>
+        </w:rPr>
+        <w:t xml:space="preserve">incondicional</w:t>
+      </w:r>
+      <w:r>
+        <w:t xml:space="preserve"> </w:t>
+      </w:r>
+      <w:r>
+        <w:t xml:space="preserve">da renda e soma 100%: a parte azul é a parcela não explicada, com o valor escrito dentro.</w:t>
+      </w:r>
+    </w:p>
     <w:bookmarkEnd w:id="63"/>
     <w:bookmarkStart w:id="70" w:name="subsec:glmm_resultados"/>
     <w:p>
@@ -22842,6 +23055,41 @@
       </w:r>
     </w:p>
     <w:bookmarkEnd w:id="67"/>
+    <w:p>
+      <w:pPr>
+        <w:pStyle w:val="BodyText"/>
+      </w:pPr>
+      <w:r>
+        <w:rPr>
+          <w:i/>
+          <w:iCs/>
+        </w:rPr>
+        <w:t xml:space="preserve">Como ler a Figura </w:t>
+      </w:r>
+      <w:hyperlink w:anchor="fig:glmm_or">
+        <w:r>
+          <w:rPr>
+            <w:rStyle w:val="Hyperlink"/>
+            <w:i/>
+            <w:iCs/>
+          </w:rPr>
+          <w:t xml:space="preserve">7</w:t>
+        </w:r>
+      </w:hyperlink>
+      <w:r>
+        <w:rPr>
+          <w:i/>
+          <w:iCs/>
+        </w:rPr>
+        <w:t xml:space="preserve">:</w:t>
+      </w:r>
+      <w:r>
+        <w:t xml:space="preserve"> </w:t>
+      </w:r>
+      <w:r>
+        <w:t xml:space="preserve">cada ponto é uma razão de chances e a linha horizontal, seu intervalo de confiança de 95%; a linha tracejada em 1 marca a paridade, de modo que quanto mais à esquerda, maior a desvantagem. Os blocos são os três desfechos e, dentro de cada um, os modelos; em azul, o M2, que compara pessoas do mesmo bairro.</w:t>
+      </w:r>
+    </w:p>
     <w:bookmarkStart w:id="68" w:name="tab:glmm_glassceil"/>
     <w:p>
       <w:pPr>

</xml_diff>

<commit_message>
fix(hlm): step-up reestimado com todos os degraus convergidos
Reexecução completa com um degrau por processo: os sete modelos fecham com
converged=True, incluindo o M3, que antes parava no bfgs. O M3 passa a ser o
ótimo de maior verossimilhança (−7.678.225 contra −7.678.368).

O que muda no relatório é o que a componente de variância indicava: ICC do M3 de
0,161 para 0,144 e variância entre bairros explicada de 75,9% para 78,9%. O
argumento não se move — gap líquido de 10,2%, mediação de 47,0% pelo bairro e
6,99% dentro da mesma ocupação, com β negro variando 0,03%.

Propagado para PDF (38 páginas, 0 erros), Word, guia de defesa, deck da banca,
deck executivo e resultados preliminares — todos leem dos mesmos csv.
Verificador: 0 ALTO, 0 MÉDIO, 0 BAIXO; restam os 2 INFO documentados (bad
controls da Oaxaca-Blinder e estimativas não ponderadas).

Co-Authored-By: Claude Opus 5 (1M context) <noreply@anthropic.com>
</commit_message>
<xml_diff>
--- a/entregaveis/relatorio_tcc_enxuto.docx
+++ b/entregaveis/relatorio_tcc_enxuto.docx
@@ -7812,7 +7812,7 @@
         <w:t xml:space="preserve"> </w:t>
       </w:r>
       <w:r>
-        <w:t xml:space="preserve">(IC 95%: [−0,1088; −0,1066]): o</w:t>
+        <w:t xml:space="preserve">(IC 95%: [−0,1087; −0,1066]): o</w:t>
       </w:r>
       <w:r>
         <w:t xml:space="preserve"> </w:t>
@@ -7840,13 +7840,13 @@
         <w:t xml:space="preserve"> </w:t>
       </w:r>
       <w:r>
-        <w:t xml:space="preserve">discriminação direta sob seleção em observáveis. O ICC cai para 0,161 e os</w:t>
-      </w:r>
-      <w:r>
-        <w:t xml:space="preserve"> </w:t>
-      </w:r>
-      <w:r>
-        <w:t xml:space="preserve">controles explicam 75,9% da variância entre bairros do M0.</w:t>
+        <w:t xml:space="preserve">discriminação direta sob seleção em observáveis. O ICC cai para 0,144 e os</w:t>
+      </w:r>
+      <w:r>
+        <w:t xml:space="preserve"> </w:t>
+      </w:r>
+      <w:r>
+        <w:t xml:space="preserve">controles explicam 78,9% da variância entre bairros do M0.</w:t>
       </w:r>
     </w:p>
     <w:p>
@@ -8019,7 +8019,7 @@
         <w:t xml:space="preserve"> </w:t>
       </w:r>
       <w:r>
-        <w:t xml:space="preserve">38.943,</w:t>
+        <w:t xml:space="preserve">38.657,</w:t>
       </w:r>
       <w:r>
         <w:t xml:space="preserve"> </w:t>
@@ -8543,7 +8543,7 @@
         </m:r>
       </m:oMath>
       <w:r>
-        <w:t xml:space="preserve">; 40.295 UPAs; 27 UFs). Coeficientes com erro-padrão do modelo entre parênteses (a correlação intra-UPA já está no efeito aleatório). Estimação por máxima verossimilhança (ML), para os testes LR entre degraus; REML coincide (Tabela de componentes). Todos os coeficientes com</w:t>
+        <w:t xml:space="preserve">; 40.295 UPAs; 27 UFs). Coeficientes com erro-padrão do modelo entre parênteses (a correlação intra-UPA já está no efeito aleatório). Estimação por máxima verossimilhança (ML), para os testes LR entre degraus; REML coincide. Todos os coeficientes com</w:t>
       </w:r>
       <w:r>
         <w:t xml:space="preserve"> </w:t>
@@ -8583,7 +8583,7 @@
         <w:tblStyle w:val="Table"/>
         <w:tblW w:type="auto" w:w="0"/>
         <w:tblLook w:firstRow="1" w:lastRow="0" w:firstColumn="0" w:lastColumn="0" w:noHBand="0" w:noVBand="0" w:val="0020"/>
-        <w:tblCaption w:val="HLM de dois níveis (indivíduo em UPA) com efeitos fixos de UF — estratégia step-up, PNAD Contínua 2016–2025, população completa (N = 7.689.426; 40.295 UPAs; 27 UFs). Coeficientes com erro-padrão do modelo entre parênteses (a correlação intra-UPA já está no efeito aleatório). Estimação por máxima verossimilhança (ML), para os testes LR entre degraus; REML coincide (Tabela de componentes). Todos os coeficientes com |t| &gt; 10; a inferência relevante está nos intervalos de confiança, não nos asteriscos (MHE, cap. 8)."/>
+        <w:tblCaption w:val="HLM de dois níveis (indivíduo em UPA) com efeitos fixos de UF — estratégia step-up, PNAD Contínua 2016–2025, população completa (N = 7.689.426; 40.295 UPAs; 27 UFs). Coeficientes com erro-padrão do modelo entre parênteses (a correlação intra-UPA já está no efeito aleatório). Estimação por máxima verossimilhança (ML), para os testes LR entre degraus; REML coincide. Todos os coeficientes com |t| &gt; 10; a inferência relevante está nos intervalos de confiança, não nos asteriscos (MHE, cap. 8)."/>
       </w:tblPr>
       <w:tblGrid>
         <w:gridCol w:w="1320"/>
@@ -8751,7 +8751,7 @@
               <w:jc w:val="center"/>
             </w:pPr>
             <w:r>
-              <w:t xml:space="preserve">4,5545 (0,0123)</w:t>
+              <w:t xml:space="preserve">4,5538 (0,0116)</w:t>
             </w:r>
           </w:p>
         </w:tc>
@@ -8977,7 +8977,7 @@
               <w:jc w:val="center"/>
             </w:pPr>
             <w:r>
-              <w:t xml:space="preserve">0,0087 (2,0e-05)</w:t>
+              <w:t xml:space="preserve">0,0087 (2,1e-05)</w:t>
             </w:r>
           </w:p>
         </w:tc>
@@ -9189,7 +9189,7 @@
               <w:jc w:val="center"/>
             </w:pPr>
             <w:r>
-              <w:t xml:space="preserve">−0,1982 (0,0038)</w:t>
+              <w:t xml:space="preserve">−0,1986 (0,0038)</w:t>
             </w:r>
           </w:p>
         </w:tc>
@@ -9485,7 +9485,7 @@
               <w:jc w:val="center"/>
             </w:pPr>
             <w:r>
-              <w:t xml:space="preserve">0,4233 (0,0025)</w:t>
+              <w:t xml:space="preserve">0,4237 (0,0025)</w:t>
             </w:r>
           </w:p>
         </w:tc>
@@ -9609,7 +9609,7 @@
               <w:jc w:val="center"/>
             </w:pPr>
             <w:r>
-              <w:t xml:space="preserve">0,6814 (0,0006)</w:t>
+              <w:t xml:space="preserve">0,6815 (0,0006)</w:t>
             </w:r>
           </w:p>
         </w:tc>
@@ -9683,7 +9683,7 @@
               <w:jc w:val="center"/>
             </w:pPr>
             <w:r>
-              <w:t xml:space="preserve">0,3347 (0,0035)</w:t>
+              <w:t xml:space="preserve">0,3347 (0,0033)</w:t>
             </w:r>
           </w:p>
         </w:tc>
@@ -9815,7 +9815,7 @@
               <w:jc w:val="center"/>
             </w:pPr>
             <w:r>
-              <w:t xml:space="preserve">−0,2504 (0,0027)</w:t>
+              <w:t xml:space="preserve">−0,2508 (0,0025)</w:t>
             </w:r>
           </w:p>
         </w:tc>
@@ -9897,7 +9897,7 @@
               <w:jc w:val="center"/>
             </w:pPr>
             <w:r>
-              <w:t xml:space="preserve">−0,0338 (0,0016)</w:t>
+              <w:t xml:space="preserve">−0,0338 (0,0015)</w:t>
             </w:r>
           </w:p>
         </w:tc>
@@ -9979,7 +9979,7 @@
               <w:jc w:val="center"/>
             </w:pPr>
             <w:r>
-              <w:t xml:space="preserve">−0,0052 (0,0013)</w:t>
+              <w:t xml:space="preserve">−0,0052 (0,0012)</w:t>
             </w:r>
           </w:p>
         </w:tc>
@@ -11012,7 +11012,7 @@
               <w:jc w:val="center"/>
             </w:pPr>
             <w:r>
-              <w:t xml:space="preserve">[−0,1088; −0,1066]</w:t>
+              <w:t xml:space="preserve">[−0,1087; −0,1066]</w:t>
             </w:r>
           </w:p>
         </w:tc>
@@ -11349,7 +11349,7 @@
               <w:jc w:val="center"/>
             </w:pPr>
             <w:r>
-              <w:t xml:space="preserve">0,0812</w:t>
+              <w:t xml:space="preserve">0,0712</w:t>
             </w:r>
           </w:p>
         </w:tc>
@@ -11447,7 +11447,7 @@
               <w:jc w:val="center"/>
             </w:pPr>
             <w:r>
-              <w:t xml:space="preserve">0,4242</w:t>
+              <w:t xml:space="preserve">0,4244</w:t>
             </w:r>
           </w:p>
         </w:tc>
@@ -11539,7 +11539,7 @@
               <w:jc w:val="center"/>
             </w:pPr>
             <w:r>
-              <w:t xml:space="preserve">0,161</w:t>
+              <w:t xml:space="preserve">0,144</w:t>
             </w:r>
           </w:p>
         </w:tc>
@@ -11630,7 +11630,7 @@
               <w:jc w:val="center"/>
             </w:pPr>
             <w:r>
-              <w:t xml:space="preserve">75,9</w:t>
+              <w:t xml:space="preserve">78,9</w:t>
             </w:r>
           </w:p>
         </w:tc>
@@ -11718,7 +11718,7 @@
               <w:jc w:val="center"/>
             </w:pPr>
             <w:r>
-              <w:t xml:space="preserve">15.356.737</w:t>
+              <w:t xml:space="preserve">15.356.451</w:t>
             </w:r>
           </w:p>
         </w:tc>
@@ -11792,7 +11792,7 @@
               <w:jc w:val="center"/>
             </w:pPr>
             <w:r>
-              <w:t xml:space="preserve">15.356.841</w:t>
+              <w:t xml:space="preserve">15.356.555</w:t>
             </w:r>
           </w:p>
         </w:tc>
@@ -11866,7 +11866,7 @@
               <w:jc w:val="center"/>
             </w:pPr>
             <w:r>
-              <w:t xml:space="preserve">15.357.561</w:t>
+              <w:t xml:space="preserve">15.357.275</w:t>
             </w:r>
           </w:p>
         </w:tc>
@@ -11957,19 +11957,19 @@
               <w:jc w:val="center"/>
             </w:pPr>
             <w:r>
-              <w:t xml:space="preserve">8.552 (26)</w:t>
-            </w:r>
-          </w:p>
-        </w:tc>
-        <w:tc>
-          <w:tcPr/>
-          <w:p>
-            <w:pPr>
-              <w:pStyle w:val="Compact"/>
-              <w:jc w:val="center"/>
-            </w:pPr>
-            <w:r>
-              <w:t xml:space="preserve">1.627.287 (12)</w:t>
+              <w:t xml:space="preserve">8.838 (26)</w:t>
+            </w:r>
+          </w:p>
+        </w:tc>
+        <w:tc>
+          <w:tcPr/>
+          <w:p>
+            <w:pPr>
+              <w:pStyle w:val="Compact"/>
+              <w:jc w:val="center"/>
+            </w:pPr>
+            <w:r>
+              <w:t xml:space="preserve">1.627.001 (12)</w:t>
             </w:r>
           </w:p>
         </w:tc>
@@ -12361,7 +12361,7 @@
           <m:t>=</m:t>
         </m:r>
         <m:r>
-          <m:t>38.943</m:t>
+          <m:t>38.657</m:t>
         </m:r>
       </m:oMath>
       <w:r>

</xml_diff>

<commit_message>
data(resultados): entregáveis com tabelas e notas pela norma (05/10/2026)
Norma 29/29, Word 50 páginas, fósseis 0, números sem fonte 0.

Co-Authored-By: Claude Opus 5.5 (1M context) <noreply@anthropic.com>
Claude-Session: https://claude.ai/code/session_01ATPBca6o9jxRv5wGBtSSkf
</commit_message>
<xml_diff>
--- a/entregaveis/relatorio_tcc_enxuto.docx
+++ b/entregaveis/relatorio_tcc_enxuto.docx
@@ -18994,7 +18994,7 @@
         <w:t xml:space="preserve"> </w:t>
       </w:r>
       <w:r>
-        <w:t xml:space="preserve">médio. Destaque em negrito: variáveis raciais/contextuais.</w:t>
+        <w:t xml:space="preserve">médio.</w:t>
       </w:r>
     </w:p>
     <w:tbl>
@@ -19002,7 +19002,7 @@
         <w:tblStyle w:val="Table"/>
         <w:tblW w:type="auto" w:w="0"/>
         <w:tblLook w:firstRow="1" w:lastRow="0" w:firstColumn="0" w:lastColumn="0" w:noHBand="0" w:noVBand="0" w:val="0020"/>
-        <w:tblCaption w:val="Importância SHAP Comparada — Random Forest e XGBoost. Predição de log-rendimento, PNAD 2016–2025 (N_{\text{SHAP}}=50.000). Valores: |\text{SHAP}| médio. Destaque em negrito: variáveis raciais/contextuais."/>
+        <w:tblCaption w:val="Importância SHAP Comparada — Random Forest e XGBoost. Predição de log-rendimento, PNAD 2016–2025 (N_{\text{SHAP}}=50.000). Valores: |\text{SHAP}| médio."/>
       </w:tblPr>
       <w:tblGrid>
         <w:gridCol w:w="1584"/>

</xml_diff>